<commit_message>
docs: update REPORT phase 2 pass c
</commit_message>
<xml_diff>
--- a/Report/REPORT.docx
+++ b/Report/REPORT.docx
@@ -13733,12 +13733,6 @@
             <w:insideH w:val="single" w:color="auto" w:sz="4" w:space="0"/>
             <w:insideV w:val="single" w:color="auto" w:sz="4" w:space="0"/>
           </w:tblBorders>
-          <w:tblCellMar>
-            <w:top w:w="0" w:type="dxa"/>
-            <w:left w:w="108" w:type="dxa"/>
-            <w:bottom w:w="0" w:type="dxa"/>
-            <w:right w:w="108" w:type="dxa"/>
-          </w:tblCellMar>
         </w:tblPrEx>
         <w:trPr>
           <w:trHeight w:val="669" w:hRule="atLeast"/>
@@ -18842,8 +18836,6 @@
         </w:rPr>
         <w:t>.</w:t>
       </w:r>
-      <w:bookmarkStart w:id="107" w:name="_GoBack"/>
-      <w:bookmarkEnd w:id="107"/>
       <w:r>
         <w:rPr>
           <w:rFonts w:hint="default"/>
@@ -20248,6 +20240,7 @@
       <w:pPr>
         <w:pStyle w:val="4"/>
         <w:numPr>
+          <w:ilvl w:val="0"/>
           <w:numId w:val="0"/>
         </w:numPr>
         <w:bidi w:val="0"/>
@@ -23454,11 +23447,1113 @@
       </w:pPr>
       <w:r>
         <w:rPr>
-          <w:lang w:val="en-US"/>
-        </w:rPr>
-        <w:t>Based on the Error_Category field, errors are grouped into three main types:</w:t>
-      </w:r>
-    </w:p>
+          <w:rFonts w:hint="default"/>
+          <w:lang w:val="en-US"/>
+        </w:rPr>
+        <w:t>E</w:t>
+      </w:r>
+      <w:r>
+        <w:rPr>
+          <w:lang w:val="en-US"/>
+        </w:rPr>
+        <w:t>rrors are grouped into three main types:</w:t>
+      </w:r>
+    </w:p>
+    <w:tbl>
+      <w:tblPr>
+        <w:tblStyle w:val="29"/>
+        <w:tblW w:w="0" w:type="auto"/>
+        <w:tblInd w:w="0" w:type="dxa"/>
+        <w:tblBorders>
+          <w:top w:val="single" w:color="auto" w:sz="4" w:space="0"/>
+          <w:left w:val="single" w:color="auto" w:sz="4" w:space="0"/>
+          <w:bottom w:val="single" w:color="auto" w:sz="4" w:space="0"/>
+          <w:right w:val="single" w:color="auto" w:sz="4" w:space="0"/>
+          <w:insideH w:val="single" w:color="auto" w:sz="4" w:space="0"/>
+          <w:insideV w:val="single" w:color="auto" w:sz="4" w:space="0"/>
+        </w:tblBorders>
+        <w:tblLayout w:type="autofit"/>
+        <w:tblCellMar>
+          <w:left w:w="108" w:type="dxa"/>
+          <w:right w:w="108" w:type="dxa"/>
+        </w:tblCellMar>
+      </w:tblPr>
+      <w:tblGrid>
+        <w:gridCol w:w="2423"/>
+        <w:gridCol w:w="2184"/>
+        <w:gridCol w:w="2210"/>
+        <w:gridCol w:w="2182"/>
+      </w:tblGrid>
+      <w:tr>
+        <w:trPr>
+          <w:trHeight w:val="486" w:hRule="atLeast"/>
+        </w:trPr>
+        <w:tc>
+          <w:tcPr>
+            <w:tcW w:w="2249" w:type="dxa"/>
+            <w:vAlign w:val="center"/>
+          </w:tcPr>
+          <w:p>
+            <w:pPr>
+              <w:keepNext w:val="0"/>
+              <w:keepLines w:val="0"/>
+              <w:widowControl/>
+              <w:suppressLineNumbers w:val="0"/>
+              <w:jc w:val="center"/>
+              <w:textAlignment w:val="center"/>
+              <w:rPr>
+                <w:b/>
+                <w:bCs/>
+                <w:vertAlign w:val="baseline"/>
+                <w:lang w:val="en-US"/>
+              </w:rPr>
+            </w:pPr>
+            <w:r>
+              <w:rPr>
+                <w:rFonts w:hint="default" w:ascii="Segoe UI" w:hAnsi="Segoe UI" w:eastAsia="Segoe UI" w:cs="Segoe UI"/>
+                <w:b/>
+                <w:bCs/>
+                <w:i w:val="0"/>
+                <w:iCs w:val="0"/>
+                <w:color w:val="000000"/>
+                <w:kern w:val="0"/>
+                <w:sz w:val="21"/>
+                <w:szCs w:val="21"/>
+                <w:u w:val="none"/>
+                <w:lang w:val="en-US" w:eastAsia="zh-CN" w:bidi="ar"/>
+              </w:rPr>
+              <w:t>Category</w:t>
+            </w:r>
+          </w:p>
+        </w:tc>
+        <w:tc>
+          <w:tcPr>
+            <w:tcW w:w="2250" w:type="dxa"/>
+            <w:vAlign w:val="center"/>
+          </w:tcPr>
+          <w:p>
+            <w:pPr>
+              <w:keepNext w:val="0"/>
+              <w:keepLines w:val="0"/>
+              <w:widowControl/>
+              <w:suppressLineNumbers w:val="0"/>
+              <w:jc w:val="center"/>
+              <w:textAlignment w:val="center"/>
+              <w:rPr>
+                <w:b/>
+                <w:bCs/>
+                <w:vertAlign w:val="baseline"/>
+                <w:lang w:val="en-US"/>
+              </w:rPr>
+            </w:pPr>
+            <w:r>
+              <w:rPr>
+                <w:rFonts w:hint="default" w:ascii="Segoe UI" w:hAnsi="Segoe UI" w:eastAsia="Segoe UI" w:cs="Segoe UI"/>
+                <w:b/>
+                <w:bCs/>
+                <w:i w:val="0"/>
+                <w:iCs w:val="0"/>
+                <w:color w:val="000000"/>
+                <w:kern w:val="0"/>
+                <w:sz w:val="21"/>
+                <w:szCs w:val="21"/>
+                <w:u w:val="none"/>
+                <w:lang w:val="en-US" w:eastAsia="zh-CN" w:bidi="ar"/>
+              </w:rPr>
+              <w:t>Printed</w:t>
+            </w:r>
+          </w:p>
+        </w:tc>
+        <w:tc>
+          <w:tcPr>
+            <w:tcW w:w="2250" w:type="dxa"/>
+            <w:vAlign w:val="center"/>
+          </w:tcPr>
+          <w:p>
+            <w:pPr>
+              <w:keepNext w:val="0"/>
+              <w:keepLines w:val="0"/>
+              <w:widowControl/>
+              <w:suppressLineNumbers w:val="0"/>
+              <w:jc w:val="center"/>
+              <w:textAlignment w:val="center"/>
+              <w:rPr>
+                <w:b/>
+                <w:bCs/>
+                <w:vertAlign w:val="baseline"/>
+                <w:lang w:val="en-US"/>
+              </w:rPr>
+            </w:pPr>
+            <w:r>
+              <w:rPr>
+                <w:rFonts w:hint="default" w:ascii="Segoe UI" w:hAnsi="Segoe UI" w:eastAsia="Segoe UI" w:cs="Segoe UI"/>
+                <w:b/>
+                <w:bCs/>
+                <w:i w:val="0"/>
+                <w:iCs w:val="0"/>
+                <w:color w:val="000000"/>
+                <w:kern w:val="0"/>
+                <w:sz w:val="21"/>
+                <w:szCs w:val="21"/>
+                <w:u w:val="none"/>
+                <w:lang w:val="en-US" w:eastAsia="zh-CN" w:bidi="ar"/>
+              </w:rPr>
+              <w:t>Handwritten</w:t>
+            </w:r>
+          </w:p>
+        </w:tc>
+        <w:tc>
+          <w:tcPr>
+            <w:tcW w:w="2250" w:type="dxa"/>
+            <w:vAlign w:val="center"/>
+          </w:tcPr>
+          <w:p>
+            <w:pPr>
+              <w:keepNext w:val="0"/>
+              <w:keepLines w:val="0"/>
+              <w:widowControl/>
+              <w:suppressLineNumbers w:val="0"/>
+              <w:jc w:val="center"/>
+              <w:textAlignment w:val="center"/>
+              <w:rPr>
+                <w:b/>
+                <w:bCs/>
+                <w:vertAlign w:val="baseline"/>
+                <w:lang w:val="en-US"/>
+              </w:rPr>
+            </w:pPr>
+            <w:r>
+              <w:rPr>
+                <w:rFonts w:hint="default" w:ascii="Segoe UI" w:hAnsi="Segoe UI" w:eastAsia="Segoe UI" w:cs="Segoe UI"/>
+                <w:b/>
+                <w:bCs/>
+                <w:i w:val="0"/>
+                <w:iCs w:val="0"/>
+                <w:color w:val="000000"/>
+                <w:kern w:val="0"/>
+                <w:sz w:val="21"/>
+                <w:szCs w:val="21"/>
+                <w:u w:val="none"/>
+                <w:lang w:val="en-US" w:eastAsia="zh-CN" w:bidi="ar"/>
+              </w:rPr>
+              <w:t>Total</w:t>
+            </w:r>
+          </w:p>
+        </w:tc>
+      </w:tr>
+      <w:tr>
+        <w:tblPrEx>
+          <w:tblBorders>
+            <w:top w:val="single" w:color="auto" w:sz="4" w:space="0"/>
+            <w:left w:val="single" w:color="auto" w:sz="4" w:space="0"/>
+            <w:bottom w:val="single" w:color="auto" w:sz="4" w:space="0"/>
+            <w:right w:val="single" w:color="auto" w:sz="4" w:space="0"/>
+            <w:insideH w:val="single" w:color="auto" w:sz="4" w:space="0"/>
+            <w:insideV w:val="single" w:color="auto" w:sz="4" w:space="0"/>
+          </w:tblBorders>
+          <w:tblCellMar>
+            <w:left w:w="108" w:type="dxa"/>
+            <w:right w:w="108" w:type="dxa"/>
+          </w:tblCellMar>
+        </w:tblPrEx>
+        <w:tc>
+          <w:tcPr>
+            <w:tcW w:w="2249" w:type="dxa"/>
+            <w:vAlign w:val="center"/>
+          </w:tcPr>
+          <w:p>
+            <w:pPr>
+              <w:keepNext w:val="0"/>
+              <w:keepLines w:val="0"/>
+              <w:widowControl/>
+              <w:suppressLineNumbers w:val="0"/>
+              <w:jc w:val="left"/>
+              <w:textAlignment w:val="center"/>
+              <w:rPr>
+                <w:vertAlign w:val="baseline"/>
+                <w:lang w:val="en-US"/>
+              </w:rPr>
+            </w:pPr>
+            <w:r>
+              <w:rPr>
+                <w:rFonts w:hint="default" w:ascii="Segoe UI" w:hAnsi="Segoe UI" w:eastAsia="Segoe UI" w:cs="Segoe UI"/>
+                <w:i w:val="0"/>
+                <w:iCs w:val="0"/>
+                <w:color w:val="000000"/>
+                <w:kern w:val="0"/>
+                <w:sz w:val="21"/>
+                <w:szCs w:val="21"/>
+                <w:u w:val="none"/>
+                <w:lang w:val="en-US" w:eastAsia="zh-CN" w:bidi="ar"/>
+              </w:rPr>
+              <w:t>PERFECT (CER=0)</w:t>
+            </w:r>
+          </w:p>
+        </w:tc>
+        <w:tc>
+          <w:tcPr>
+            <w:tcW w:w="2250" w:type="dxa"/>
+            <w:vAlign w:val="center"/>
+          </w:tcPr>
+          <w:p>
+            <w:pPr>
+              <w:keepNext w:val="0"/>
+              <w:keepLines w:val="0"/>
+              <w:widowControl/>
+              <w:suppressLineNumbers w:val="0"/>
+              <w:jc w:val="left"/>
+              <w:textAlignment w:val="center"/>
+              <w:rPr>
+                <w:vertAlign w:val="baseline"/>
+                <w:lang w:val="en-US"/>
+              </w:rPr>
+            </w:pPr>
+            <w:r>
+              <w:rPr>
+                <w:rFonts w:hint="default" w:ascii="Segoe UI" w:hAnsi="Segoe UI" w:eastAsia="Segoe UI" w:cs="Segoe UI"/>
+                <w:i w:val="0"/>
+                <w:iCs w:val="0"/>
+                <w:color w:val="000000"/>
+                <w:kern w:val="0"/>
+                <w:sz w:val="21"/>
+                <w:szCs w:val="21"/>
+                <w:u w:val="none"/>
+                <w:lang w:val="en-US" w:eastAsia="zh-CN" w:bidi="ar"/>
+              </w:rPr>
+              <w:t>2,562 (68.5%)</w:t>
+            </w:r>
+          </w:p>
+        </w:tc>
+        <w:tc>
+          <w:tcPr>
+            <w:tcW w:w="2250" w:type="dxa"/>
+            <w:vAlign w:val="center"/>
+          </w:tcPr>
+          <w:p>
+            <w:pPr>
+              <w:keepNext w:val="0"/>
+              <w:keepLines w:val="0"/>
+              <w:widowControl/>
+              <w:suppressLineNumbers w:val="0"/>
+              <w:jc w:val="left"/>
+              <w:textAlignment w:val="center"/>
+              <w:rPr>
+                <w:vertAlign w:val="baseline"/>
+                <w:lang w:val="en-US"/>
+              </w:rPr>
+            </w:pPr>
+            <w:r>
+              <w:rPr>
+                <w:rFonts w:hint="default" w:ascii="Segoe UI" w:hAnsi="Segoe UI" w:eastAsia="Segoe UI" w:cs="Segoe UI"/>
+                <w:i w:val="0"/>
+                <w:iCs w:val="0"/>
+                <w:color w:val="000000"/>
+                <w:kern w:val="0"/>
+                <w:sz w:val="21"/>
+                <w:szCs w:val="21"/>
+                <w:u w:val="none"/>
+                <w:lang w:val="en-US" w:eastAsia="zh-CN" w:bidi="ar"/>
+              </w:rPr>
+              <w:t>109 (14.8%)</w:t>
+            </w:r>
+          </w:p>
+        </w:tc>
+        <w:tc>
+          <w:tcPr>
+            <w:tcW w:w="2250" w:type="dxa"/>
+            <w:vAlign w:val="center"/>
+          </w:tcPr>
+          <w:p>
+            <w:pPr>
+              <w:keepNext w:val="0"/>
+              <w:keepLines w:val="0"/>
+              <w:widowControl/>
+              <w:suppressLineNumbers w:val="0"/>
+              <w:jc w:val="left"/>
+              <w:textAlignment w:val="center"/>
+              <w:rPr>
+                <w:vertAlign w:val="baseline"/>
+                <w:lang w:val="en-US"/>
+              </w:rPr>
+            </w:pPr>
+            <w:r>
+              <w:rPr>
+                <w:rFonts w:hint="default" w:ascii="Segoe UI" w:hAnsi="Segoe UI" w:eastAsia="Segoe UI" w:cs="Segoe UI"/>
+                <w:i w:val="0"/>
+                <w:iCs w:val="0"/>
+                <w:color w:val="000000"/>
+                <w:kern w:val="0"/>
+                <w:sz w:val="21"/>
+                <w:szCs w:val="21"/>
+                <w:u w:val="none"/>
+                <w:lang w:val="en-US" w:eastAsia="zh-CN" w:bidi="ar"/>
+              </w:rPr>
+              <w:t>2,671 (59.7%)</w:t>
+            </w:r>
+          </w:p>
+        </w:tc>
+      </w:tr>
+      <w:tr>
+        <w:tblPrEx>
+          <w:tblBorders>
+            <w:top w:val="single" w:color="auto" w:sz="4" w:space="0"/>
+            <w:left w:val="single" w:color="auto" w:sz="4" w:space="0"/>
+            <w:bottom w:val="single" w:color="auto" w:sz="4" w:space="0"/>
+            <w:right w:val="single" w:color="auto" w:sz="4" w:space="0"/>
+            <w:insideH w:val="single" w:color="auto" w:sz="4" w:space="0"/>
+            <w:insideV w:val="single" w:color="auto" w:sz="4" w:space="0"/>
+          </w:tblBorders>
+          <w:tblCellMar>
+            <w:left w:w="108" w:type="dxa"/>
+            <w:right w:w="108" w:type="dxa"/>
+          </w:tblCellMar>
+        </w:tblPrEx>
+        <w:tc>
+          <w:tcPr>
+            <w:tcW w:w="2249" w:type="dxa"/>
+            <w:vAlign w:val="center"/>
+          </w:tcPr>
+          <w:p>
+            <w:pPr>
+              <w:keepNext w:val="0"/>
+              <w:keepLines w:val="0"/>
+              <w:widowControl/>
+              <w:suppressLineNumbers w:val="0"/>
+              <w:jc w:val="left"/>
+              <w:textAlignment w:val="center"/>
+              <w:rPr>
+                <w:vertAlign w:val="baseline"/>
+                <w:lang w:val="en-US"/>
+              </w:rPr>
+            </w:pPr>
+            <w:r>
+              <w:rPr>
+                <w:rFonts w:hint="default" w:ascii="Segoe UI" w:hAnsi="Segoe UI" w:eastAsia="Segoe UI" w:cs="Segoe UI"/>
+                <w:i w:val="0"/>
+                <w:iCs w:val="0"/>
+                <w:color w:val="000000"/>
+                <w:kern w:val="0"/>
+                <w:sz w:val="21"/>
+                <w:szCs w:val="21"/>
+                <w:u w:val="none"/>
+                <w:lang w:val="en-US" w:eastAsia="zh-CN" w:bidi="ar"/>
+              </w:rPr>
+              <w:t>MINOR_ERROR (CER≤0.30)</w:t>
+            </w:r>
+          </w:p>
+        </w:tc>
+        <w:tc>
+          <w:tcPr>
+            <w:tcW w:w="2250" w:type="dxa"/>
+            <w:vAlign w:val="center"/>
+          </w:tcPr>
+          <w:p>
+            <w:pPr>
+              <w:keepNext w:val="0"/>
+              <w:keepLines w:val="0"/>
+              <w:widowControl/>
+              <w:suppressLineNumbers w:val="0"/>
+              <w:jc w:val="left"/>
+              <w:textAlignment w:val="center"/>
+              <w:rPr>
+                <w:vertAlign w:val="baseline"/>
+                <w:lang w:val="en-US"/>
+              </w:rPr>
+            </w:pPr>
+            <w:r>
+              <w:rPr>
+                <w:rFonts w:hint="default" w:ascii="Segoe UI" w:hAnsi="Segoe UI" w:eastAsia="Segoe UI" w:cs="Segoe UI"/>
+                <w:i w:val="0"/>
+                <w:iCs w:val="0"/>
+                <w:color w:val="000000"/>
+                <w:kern w:val="0"/>
+                <w:sz w:val="21"/>
+                <w:szCs w:val="21"/>
+                <w:u w:val="none"/>
+                <w:lang w:val="en-US" w:eastAsia="zh-CN" w:bidi="ar"/>
+              </w:rPr>
+              <w:t>TBD</w:t>
+            </w:r>
+          </w:p>
+        </w:tc>
+        <w:tc>
+          <w:tcPr>
+            <w:tcW w:w="2250" w:type="dxa"/>
+            <w:vAlign w:val="center"/>
+          </w:tcPr>
+          <w:p>
+            <w:pPr>
+              <w:keepNext w:val="0"/>
+              <w:keepLines w:val="0"/>
+              <w:widowControl/>
+              <w:suppressLineNumbers w:val="0"/>
+              <w:jc w:val="left"/>
+              <w:textAlignment w:val="center"/>
+              <w:rPr>
+                <w:vertAlign w:val="baseline"/>
+                <w:lang w:val="en-US"/>
+              </w:rPr>
+            </w:pPr>
+            <w:r>
+              <w:rPr>
+                <w:rFonts w:hint="default" w:ascii="Segoe UI" w:hAnsi="Segoe UI" w:eastAsia="Segoe UI" w:cs="Segoe UI"/>
+                <w:i w:val="0"/>
+                <w:iCs w:val="0"/>
+                <w:color w:val="000000"/>
+                <w:kern w:val="0"/>
+                <w:sz w:val="21"/>
+                <w:szCs w:val="21"/>
+                <w:u w:val="none"/>
+                <w:lang w:val="en-US" w:eastAsia="zh-CN" w:bidi="ar"/>
+              </w:rPr>
+              <w:t>TBD</w:t>
+            </w:r>
+          </w:p>
+        </w:tc>
+        <w:tc>
+          <w:tcPr>
+            <w:tcW w:w="2250" w:type="dxa"/>
+            <w:vAlign w:val="center"/>
+          </w:tcPr>
+          <w:p>
+            <w:pPr>
+              <w:keepNext w:val="0"/>
+              <w:keepLines w:val="0"/>
+              <w:widowControl/>
+              <w:suppressLineNumbers w:val="0"/>
+              <w:jc w:val="left"/>
+              <w:textAlignment w:val="center"/>
+              <w:rPr>
+                <w:vertAlign w:val="baseline"/>
+                <w:lang w:val="en-US"/>
+              </w:rPr>
+            </w:pPr>
+            <w:r>
+              <w:rPr>
+                <w:rFonts w:hint="default" w:ascii="Segoe UI" w:hAnsi="Segoe UI" w:eastAsia="Segoe UI" w:cs="Segoe UI"/>
+                <w:i w:val="0"/>
+                <w:iCs w:val="0"/>
+                <w:color w:val="000000"/>
+                <w:kern w:val="0"/>
+                <w:sz w:val="21"/>
+                <w:szCs w:val="21"/>
+                <w:u w:val="none"/>
+                <w:lang w:val="en-US" w:eastAsia="zh-CN" w:bidi="ar"/>
+              </w:rPr>
+              <w:t>TBD</w:t>
+            </w:r>
+          </w:p>
+        </w:tc>
+      </w:tr>
+      <w:tr>
+        <w:tblPrEx>
+          <w:tblBorders>
+            <w:top w:val="single" w:color="auto" w:sz="4" w:space="0"/>
+            <w:left w:val="single" w:color="auto" w:sz="4" w:space="0"/>
+            <w:bottom w:val="single" w:color="auto" w:sz="4" w:space="0"/>
+            <w:right w:val="single" w:color="auto" w:sz="4" w:space="0"/>
+            <w:insideH w:val="single" w:color="auto" w:sz="4" w:space="0"/>
+            <w:insideV w:val="single" w:color="auto" w:sz="4" w:space="0"/>
+          </w:tblBorders>
+          <w:tblCellMar>
+            <w:left w:w="108" w:type="dxa"/>
+            <w:right w:w="108" w:type="dxa"/>
+          </w:tblCellMar>
+        </w:tblPrEx>
+        <w:tc>
+          <w:tcPr>
+            <w:tcW w:w="2249" w:type="dxa"/>
+            <w:vAlign w:val="center"/>
+          </w:tcPr>
+          <w:p>
+            <w:pPr>
+              <w:keepNext w:val="0"/>
+              <w:keepLines w:val="0"/>
+              <w:widowControl/>
+              <w:suppressLineNumbers w:val="0"/>
+              <w:jc w:val="left"/>
+              <w:textAlignment w:val="center"/>
+              <w:rPr>
+                <w:vertAlign w:val="baseline"/>
+                <w:lang w:val="en-US"/>
+              </w:rPr>
+            </w:pPr>
+            <w:r>
+              <w:rPr>
+                <w:rFonts w:hint="default" w:ascii="Segoe UI" w:hAnsi="Segoe UI" w:eastAsia="Segoe UI" w:cs="Segoe UI"/>
+                <w:i w:val="0"/>
+                <w:iCs w:val="0"/>
+                <w:color w:val="000000"/>
+                <w:kern w:val="0"/>
+                <w:sz w:val="21"/>
+                <w:szCs w:val="21"/>
+                <w:u w:val="none"/>
+                <w:lang w:val="en-US" w:eastAsia="zh-CN" w:bidi="ar"/>
+              </w:rPr>
+              <w:t>SUBSTITUTION (CER&gt;0.30)</w:t>
+            </w:r>
+          </w:p>
+        </w:tc>
+        <w:tc>
+          <w:tcPr>
+            <w:tcW w:w="2250" w:type="dxa"/>
+            <w:vAlign w:val="center"/>
+          </w:tcPr>
+          <w:p>
+            <w:pPr>
+              <w:keepNext w:val="0"/>
+              <w:keepLines w:val="0"/>
+              <w:widowControl/>
+              <w:suppressLineNumbers w:val="0"/>
+              <w:jc w:val="left"/>
+              <w:textAlignment w:val="center"/>
+              <w:rPr>
+                <w:vertAlign w:val="baseline"/>
+                <w:lang w:val="en-US"/>
+              </w:rPr>
+            </w:pPr>
+            <w:r>
+              <w:rPr>
+                <w:rFonts w:hint="default" w:ascii="Segoe UI" w:hAnsi="Segoe UI" w:eastAsia="Segoe UI" w:cs="Segoe UI"/>
+                <w:i w:val="0"/>
+                <w:iCs w:val="0"/>
+                <w:color w:val="000000"/>
+                <w:kern w:val="0"/>
+                <w:sz w:val="21"/>
+                <w:szCs w:val="21"/>
+                <w:u w:val="none"/>
+                <w:lang w:val="en-US" w:eastAsia="zh-CN" w:bidi="ar"/>
+              </w:rPr>
+              <w:t>TBD</w:t>
+            </w:r>
+          </w:p>
+        </w:tc>
+        <w:tc>
+          <w:tcPr>
+            <w:tcW w:w="2250" w:type="dxa"/>
+            <w:vAlign w:val="center"/>
+          </w:tcPr>
+          <w:p>
+            <w:pPr>
+              <w:keepNext w:val="0"/>
+              <w:keepLines w:val="0"/>
+              <w:widowControl/>
+              <w:suppressLineNumbers w:val="0"/>
+              <w:jc w:val="left"/>
+              <w:textAlignment w:val="center"/>
+              <w:rPr>
+                <w:vertAlign w:val="baseline"/>
+                <w:lang w:val="en-US"/>
+              </w:rPr>
+            </w:pPr>
+            <w:r>
+              <w:rPr>
+                <w:rFonts w:hint="default" w:ascii="Segoe UI" w:hAnsi="Segoe UI" w:eastAsia="Segoe UI" w:cs="Segoe UI"/>
+                <w:i w:val="0"/>
+                <w:iCs w:val="0"/>
+                <w:color w:val="000000"/>
+                <w:kern w:val="0"/>
+                <w:sz w:val="21"/>
+                <w:szCs w:val="21"/>
+                <w:u w:val="none"/>
+                <w:lang w:val="en-US" w:eastAsia="zh-CN" w:bidi="ar"/>
+              </w:rPr>
+              <w:t>TBD</w:t>
+            </w:r>
+          </w:p>
+        </w:tc>
+        <w:tc>
+          <w:tcPr>
+            <w:tcW w:w="2250" w:type="dxa"/>
+            <w:vAlign w:val="center"/>
+          </w:tcPr>
+          <w:p>
+            <w:pPr>
+              <w:keepNext w:val="0"/>
+              <w:keepLines w:val="0"/>
+              <w:widowControl/>
+              <w:suppressLineNumbers w:val="0"/>
+              <w:jc w:val="left"/>
+              <w:textAlignment w:val="center"/>
+              <w:rPr>
+                <w:vertAlign w:val="baseline"/>
+                <w:lang w:val="en-US"/>
+              </w:rPr>
+            </w:pPr>
+            <w:r>
+              <w:rPr>
+                <w:rFonts w:hint="default" w:ascii="Segoe UI" w:hAnsi="Segoe UI" w:eastAsia="Segoe UI" w:cs="Segoe UI"/>
+                <w:i w:val="0"/>
+                <w:iCs w:val="0"/>
+                <w:color w:val="000000"/>
+                <w:kern w:val="0"/>
+                <w:sz w:val="21"/>
+                <w:szCs w:val="21"/>
+                <w:u w:val="none"/>
+                <w:lang w:val="en-US" w:eastAsia="zh-CN" w:bidi="ar"/>
+              </w:rPr>
+              <w:t>TBD</w:t>
+            </w:r>
+          </w:p>
+        </w:tc>
+      </w:tr>
+      <w:tr>
+        <w:tblPrEx>
+          <w:tblBorders>
+            <w:top w:val="single" w:color="auto" w:sz="4" w:space="0"/>
+            <w:left w:val="single" w:color="auto" w:sz="4" w:space="0"/>
+            <w:bottom w:val="single" w:color="auto" w:sz="4" w:space="0"/>
+            <w:right w:val="single" w:color="auto" w:sz="4" w:space="0"/>
+            <w:insideH w:val="single" w:color="auto" w:sz="4" w:space="0"/>
+            <w:insideV w:val="single" w:color="auto" w:sz="4" w:space="0"/>
+          </w:tblBorders>
+          <w:tblCellMar>
+            <w:left w:w="108" w:type="dxa"/>
+            <w:right w:w="108" w:type="dxa"/>
+          </w:tblCellMar>
+        </w:tblPrEx>
+        <w:tc>
+          <w:tcPr>
+            <w:tcW w:w="2249" w:type="dxa"/>
+            <w:vAlign w:val="center"/>
+          </w:tcPr>
+          <w:p>
+            <w:pPr>
+              <w:keepNext w:val="0"/>
+              <w:keepLines w:val="0"/>
+              <w:widowControl/>
+              <w:suppressLineNumbers w:val="0"/>
+              <w:jc w:val="left"/>
+              <w:textAlignment w:val="center"/>
+              <w:rPr>
+                <w:vertAlign w:val="baseline"/>
+                <w:lang w:val="en-US"/>
+              </w:rPr>
+            </w:pPr>
+            <w:r>
+              <w:rPr>
+                <w:rFonts w:hint="default" w:ascii="Segoe UI" w:hAnsi="Segoe UI" w:eastAsia="Segoe UI" w:cs="Segoe UI"/>
+                <w:i w:val="0"/>
+                <w:iCs w:val="0"/>
+                <w:color w:val="000000"/>
+                <w:kern w:val="0"/>
+                <w:sz w:val="21"/>
+                <w:szCs w:val="21"/>
+                <w:u w:val="none"/>
+                <w:lang w:val="en-US" w:eastAsia="zh-CN" w:bidi="ar"/>
+              </w:rPr>
+              <w:t>HALLUCINATION_LOOP</w:t>
+            </w:r>
+          </w:p>
+        </w:tc>
+        <w:tc>
+          <w:tcPr>
+            <w:tcW w:w="2250" w:type="dxa"/>
+            <w:vAlign w:val="center"/>
+          </w:tcPr>
+          <w:p>
+            <w:pPr>
+              <w:keepNext w:val="0"/>
+              <w:keepLines w:val="0"/>
+              <w:widowControl/>
+              <w:suppressLineNumbers w:val="0"/>
+              <w:jc w:val="left"/>
+              <w:textAlignment w:val="center"/>
+              <w:rPr>
+                <w:vertAlign w:val="baseline"/>
+                <w:lang w:val="en-US"/>
+              </w:rPr>
+            </w:pPr>
+            <w:r>
+              <w:rPr>
+                <w:rFonts w:hint="default" w:ascii="Segoe UI" w:hAnsi="Segoe UI" w:eastAsia="Segoe UI" w:cs="Segoe UI"/>
+                <w:i w:val="0"/>
+                <w:iCs w:val="0"/>
+                <w:color w:val="000000"/>
+                <w:kern w:val="0"/>
+                <w:sz w:val="21"/>
+                <w:szCs w:val="21"/>
+                <w:u w:val="none"/>
+                <w:lang w:val="en-US" w:eastAsia="zh-CN" w:bidi="ar"/>
+              </w:rPr>
+              <w:t>TBD</w:t>
+            </w:r>
+          </w:p>
+        </w:tc>
+        <w:tc>
+          <w:tcPr>
+            <w:tcW w:w="2250" w:type="dxa"/>
+            <w:vAlign w:val="center"/>
+          </w:tcPr>
+          <w:p>
+            <w:pPr>
+              <w:keepNext w:val="0"/>
+              <w:keepLines w:val="0"/>
+              <w:widowControl/>
+              <w:suppressLineNumbers w:val="0"/>
+              <w:jc w:val="left"/>
+              <w:textAlignment w:val="center"/>
+              <w:rPr>
+                <w:vertAlign w:val="baseline"/>
+                <w:lang w:val="en-US"/>
+              </w:rPr>
+            </w:pPr>
+            <w:r>
+              <w:rPr>
+                <w:rFonts w:hint="default" w:ascii="Segoe UI" w:hAnsi="Segoe UI" w:eastAsia="Segoe UI" w:cs="Segoe UI"/>
+                <w:i w:val="0"/>
+                <w:iCs w:val="0"/>
+                <w:color w:val="000000"/>
+                <w:kern w:val="0"/>
+                <w:sz w:val="21"/>
+                <w:szCs w:val="21"/>
+                <w:u w:val="none"/>
+                <w:lang w:val="en-US" w:eastAsia="zh-CN" w:bidi="ar"/>
+              </w:rPr>
+              <w:t>TBD</w:t>
+            </w:r>
+          </w:p>
+        </w:tc>
+        <w:tc>
+          <w:tcPr>
+            <w:tcW w:w="2250" w:type="dxa"/>
+            <w:vAlign w:val="center"/>
+          </w:tcPr>
+          <w:p>
+            <w:pPr>
+              <w:keepNext w:val="0"/>
+              <w:keepLines w:val="0"/>
+              <w:widowControl/>
+              <w:suppressLineNumbers w:val="0"/>
+              <w:jc w:val="left"/>
+              <w:textAlignment w:val="center"/>
+              <w:rPr>
+                <w:vertAlign w:val="baseline"/>
+                <w:lang w:val="en-US"/>
+              </w:rPr>
+            </w:pPr>
+            <w:r>
+              <w:rPr>
+                <w:rFonts w:hint="default" w:ascii="Segoe UI" w:hAnsi="Segoe UI" w:eastAsia="Segoe UI" w:cs="Segoe UI"/>
+                <w:i w:val="0"/>
+                <w:iCs w:val="0"/>
+                <w:color w:val="000000"/>
+                <w:kern w:val="0"/>
+                <w:sz w:val="21"/>
+                <w:szCs w:val="21"/>
+                <w:u w:val="none"/>
+                <w:lang w:val="en-US" w:eastAsia="zh-CN" w:bidi="ar"/>
+              </w:rPr>
+              <w:t>TBD</w:t>
+            </w:r>
+          </w:p>
+        </w:tc>
+      </w:tr>
+      <w:tr>
+        <w:tblPrEx>
+          <w:tblBorders>
+            <w:top w:val="single" w:color="auto" w:sz="4" w:space="0"/>
+            <w:left w:val="single" w:color="auto" w:sz="4" w:space="0"/>
+            <w:bottom w:val="single" w:color="auto" w:sz="4" w:space="0"/>
+            <w:right w:val="single" w:color="auto" w:sz="4" w:space="0"/>
+            <w:insideH w:val="single" w:color="auto" w:sz="4" w:space="0"/>
+            <w:insideV w:val="single" w:color="auto" w:sz="4" w:space="0"/>
+          </w:tblBorders>
+          <w:tblCellMar>
+            <w:left w:w="108" w:type="dxa"/>
+            <w:right w:w="108" w:type="dxa"/>
+          </w:tblCellMar>
+        </w:tblPrEx>
+        <w:tc>
+          <w:tcPr>
+            <w:tcW w:w="2249" w:type="dxa"/>
+            <w:vAlign w:val="center"/>
+          </w:tcPr>
+          <w:p>
+            <w:pPr>
+              <w:keepNext w:val="0"/>
+              <w:keepLines w:val="0"/>
+              <w:widowControl/>
+              <w:suppressLineNumbers w:val="0"/>
+              <w:jc w:val="left"/>
+              <w:textAlignment w:val="center"/>
+              <w:rPr>
+                <w:vertAlign w:val="baseline"/>
+                <w:lang w:val="en-US"/>
+              </w:rPr>
+            </w:pPr>
+            <w:r>
+              <w:rPr>
+                <w:rFonts w:hint="default" w:ascii="Segoe UI" w:hAnsi="Segoe UI" w:eastAsia="Segoe UI" w:cs="Segoe UI"/>
+                <w:i w:val="0"/>
+                <w:iCs w:val="0"/>
+                <w:color w:val="000000"/>
+                <w:kern w:val="0"/>
+                <w:sz w:val="21"/>
+                <w:szCs w:val="21"/>
+                <w:u w:val="none"/>
+                <w:lang w:val="en-US" w:eastAsia="zh-CN" w:bidi="ar"/>
+              </w:rPr>
+              <w:t>TRUNCATION</w:t>
+            </w:r>
+          </w:p>
+        </w:tc>
+        <w:tc>
+          <w:tcPr>
+            <w:tcW w:w="2250" w:type="dxa"/>
+            <w:vAlign w:val="center"/>
+          </w:tcPr>
+          <w:p>
+            <w:pPr>
+              <w:keepNext w:val="0"/>
+              <w:keepLines w:val="0"/>
+              <w:widowControl/>
+              <w:suppressLineNumbers w:val="0"/>
+              <w:jc w:val="left"/>
+              <w:textAlignment w:val="center"/>
+              <w:rPr>
+                <w:vertAlign w:val="baseline"/>
+                <w:lang w:val="en-US"/>
+              </w:rPr>
+            </w:pPr>
+            <w:r>
+              <w:rPr>
+                <w:rFonts w:hint="default" w:ascii="Segoe UI" w:hAnsi="Segoe UI" w:eastAsia="Segoe UI" w:cs="Segoe UI"/>
+                <w:i w:val="0"/>
+                <w:iCs w:val="0"/>
+                <w:color w:val="000000"/>
+                <w:kern w:val="0"/>
+                <w:sz w:val="21"/>
+                <w:szCs w:val="21"/>
+                <w:u w:val="none"/>
+                <w:lang w:val="en-US" w:eastAsia="zh-CN" w:bidi="ar"/>
+              </w:rPr>
+              <w:t>TBD</w:t>
+            </w:r>
+          </w:p>
+        </w:tc>
+        <w:tc>
+          <w:tcPr>
+            <w:tcW w:w="2250" w:type="dxa"/>
+            <w:vAlign w:val="center"/>
+          </w:tcPr>
+          <w:p>
+            <w:pPr>
+              <w:keepNext w:val="0"/>
+              <w:keepLines w:val="0"/>
+              <w:widowControl/>
+              <w:suppressLineNumbers w:val="0"/>
+              <w:jc w:val="left"/>
+              <w:textAlignment w:val="center"/>
+              <w:rPr>
+                <w:vertAlign w:val="baseline"/>
+                <w:lang w:val="en-US"/>
+              </w:rPr>
+            </w:pPr>
+            <w:r>
+              <w:rPr>
+                <w:rFonts w:hint="default" w:ascii="Segoe UI" w:hAnsi="Segoe UI" w:eastAsia="Segoe UI" w:cs="Segoe UI"/>
+                <w:i w:val="0"/>
+                <w:iCs w:val="0"/>
+                <w:color w:val="000000"/>
+                <w:kern w:val="0"/>
+                <w:sz w:val="21"/>
+                <w:szCs w:val="21"/>
+                <w:u w:val="none"/>
+                <w:lang w:val="en-US" w:eastAsia="zh-CN" w:bidi="ar"/>
+              </w:rPr>
+              <w:t>TBD</w:t>
+            </w:r>
+          </w:p>
+        </w:tc>
+        <w:tc>
+          <w:tcPr>
+            <w:tcW w:w="2250" w:type="dxa"/>
+            <w:vAlign w:val="center"/>
+          </w:tcPr>
+          <w:p>
+            <w:pPr>
+              <w:keepNext w:val="0"/>
+              <w:keepLines w:val="0"/>
+              <w:widowControl/>
+              <w:suppressLineNumbers w:val="0"/>
+              <w:jc w:val="left"/>
+              <w:textAlignment w:val="center"/>
+              <w:rPr>
+                <w:vertAlign w:val="baseline"/>
+                <w:lang w:val="en-US"/>
+              </w:rPr>
+            </w:pPr>
+            <w:r>
+              <w:rPr>
+                <w:rFonts w:hint="default" w:ascii="Segoe UI" w:hAnsi="Segoe UI" w:eastAsia="Segoe UI" w:cs="Segoe UI"/>
+                <w:i w:val="0"/>
+                <w:iCs w:val="0"/>
+                <w:color w:val="000000"/>
+                <w:kern w:val="0"/>
+                <w:sz w:val="21"/>
+                <w:szCs w:val="21"/>
+                <w:u w:val="none"/>
+                <w:lang w:val="en-US" w:eastAsia="zh-CN" w:bidi="ar"/>
+              </w:rPr>
+              <w:t>TBD</w:t>
+            </w:r>
+          </w:p>
+        </w:tc>
+      </w:tr>
+      <w:tr>
+        <w:tblPrEx>
+          <w:tblBorders>
+            <w:top w:val="single" w:color="auto" w:sz="4" w:space="0"/>
+            <w:left w:val="single" w:color="auto" w:sz="4" w:space="0"/>
+            <w:bottom w:val="single" w:color="auto" w:sz="4" w:space="0"/>
+            <w:right w:val="single" w:color="auto" w:sz="4" w:space="0"/>
+            <w:insideH w:val="single" w:color="auto" w:sz="4" w:space="0"/>
+            <w:insideV w:val="single" w:color="auto" w:sz="4" w:space="0"/>
+          </w:tblBorders>
+          <w:tblCellMar>
+            <w:left w:w="108" w:type="dxa"/>
+            <w:right w:w="108" w:type="dxa"/>
+          </w:tblCellMar>
+        </w:tblPrEx>
+        <w:tc>
+          <w:tcPr>
+            <w:tcW w:w="2249" w:type="dxa"/>
+            <w:vAlign w:val="center"/>
+          </w:tcPr>
+          <w:p>
+            <w:pPr>
+              <w:keepNext w:val="0"/>
+              <w:keepLines w:val="0"/>
+              <w:widowControl/>
+              <w:suppressLineNumbers w:val="0"/>
+              <w:jc w:val="left"/>
+              <w:textAlignment w:val="center"/>
+              <w:rPr>
+                <w:vertAlign w:val="baseline"/>
+                <w:lang w:val="en-US"/>
+              </w:rPr>
+            </w:pPr>
+            <w:r>
+              <w:rPr>
+                <w:rFonts w:hint="default" w:ascii="Segoe UI" w:hAnsi="Segoe UI" w:eastAsia="Segoe UI" w:cs="Segoe UI"/>
+                <w:i w:val="0"/>
+                <w:iCs w:val="0"/>
+                <w:color w:val="000000"/>
+                <w:kern w:val="0"/>
+                <w:sz w:val="21"/>
+                <w:szCs w:val="21"/>
+                <w:u w:val="none"/>
+                <w:lang w:val="en-US" w:eastAsia="zh-CN" w:bidi="ar"/>
+              </w:rPr>
+              <w:t>INSERTION</w:t>
+            </w:r>
+          </w:p>
+        </w:tc>
+        <w:tc>
+          <w:tcPr>
+            <w:tcW w:w="2250" w:type="dxa"/>
+            <w:vAlign w:val="center"/>
+          </w:tcPr>
+          <w:p>
+            <w:pPr>
+              <w:keepNext w:val="0"/>
+              <w:keepLines w:val="0"/>
+              <w:widowControl/>
+              <w:suppressLineNumbers w:val="0"/>
+              <w:jc w:val="left"/>
+              <w:textAlignment w:val="center"/>
+              <w:rPr>
+                <w:vertAlign w:val="baseline"/>
+                <w:lang w:val="en-US"/>
+              </w:rPr>
+            </w:pPr>
+            <w:r>
+              <w:rPr>
+                <w:rFonts w:hint="default" w:ascii="Segoe UI" w:hAnsi="Segoe UI" w:eastAsia="Segoe UI" w:cs="Segoe UI"/>
+                <w:i w:val="0"/>
+                <w:iCs w:val="0"/>
+                <w:color w:val="000000"/>
+                <w:kern w:val="0"/>
+                <w:sz w:val="21"/>
+                <w:szCs w:val="21"/>
+                <w:u w:val="none"/>
+                <w:lang w:val="en-US" w:eastAsia="zh-CN" w:bidi="ar"/>
+              </w:rPr>
+              <w:t>TBD</w:t>
+            </w:r>
+          </w:p>
+        </w:tc>
+        <w:tc>
+          <w:tcPr>
+            <w:tcW w:w="2250" w:type="dxa"/>
+            <w:vAlign w:val="center"/>
+          </w:tcPr>
+          <w:p>
+            <w:pPr>
+              <w:keepNext w:val="0"/>
+              <w:keepLines w:val="0"/>
+              <w:widowControl/>
+              <w:suppressLineNumbers w:val="0"/>
+              <w:jc w:val="left"/>
+              <w:textAlignment w:val="center"/>
+              <w:rPr>
+                <w:vertAlign w:val="baseline"/>
+                <w:lang w:val="en-US"/>
+              </w:rPr>
+            </w:pPr>
+            <w:r>
+              <w:rPr>
+                <w:rFonts w:hint="default" w:ascii="Segoe UI" w:hAnsi="Segoe UI" w:eastAsia="Segoe UI" w:cs="Segoe UI"/>
+                <w:i w:val="0"/>
+                <w:iCs w:val="0"/>
+                <w:color w:val="000000"/>
+                <w:kern w:val="0"/>
+                <w:sz w:val="21"/>
+                <w:szCs w:val="21"/>
+                <w:u w:val="none"/>
+                <w:lang w:val="en-US" w:eastAsia="zh-CN" w:bidi="ar"/>
+              </w:rPr>
+              <w:t>TBD</w:t>
+            </w:r>
+          </w:p>
+        </w:tc>
+        <w:tc>
+          <w:tcPr>
+            <w:tcW w:w="2250" w:type="dxa"/>
+            <w:vAlign w:val="center"/>
+          </w:tcPr>
+          <w:p>
+            <w:pPr>
+              <w:keepNext w:val="0"/>
+              <w:keepLines w:val="0"/>
+              <w:widowControl/>
+              <w:suppressLineNumbers w:val="0"/>
+              <w:jc w:val="left"/>
+              <w:textAlignment w:val="center"/>
+              <w:rPr>
+                <w:vertAlign w:val="baseline"/>
+                <w:lang w:val="en-US"/>
+              </w:rPr>
+            </w:pPr>
+            <w:r>
+              <w:rPr>
+                <w:rFonts w:hint="default" w:ascii="Segoe UI" w:hAnsi="Segoe UI" w:eastAsia="Segoe UI" w:cs="Segoe UI"/>
+                <w:i w:val="0"/>
+                <w:iCs w:val="0"/>
+                <w:color w:val="000000"/>
+                <w:kern w:val="0"/>
+                <w:sz w:val="21"/>
+                <w:szCs w:val="21"/>
+                <w:u w:val="none"/>
+                <w:lang w:val="en-US" w:eastAsia="zh-CN" w:bidi="ar"/>
+              </w:rPr>
+              <w:t>TBD</w:t>
+            </w:r>
+          </w:p>
+        </w:tc>
+      </w:tr>
+    </w:tbl>
     <w:p>
       <w:pPr>
         <w:pStyle w:val="4"/>
@@ -23467,50 +24562,10 @@
           <w:numId w:val="0"/>
         </w:numPr>
         <w:bidi w:val="0"/>
-      </w:pPr>
-      <w:r>
-        <w:drawing>
-          <wp:inline distT="0" distB="0" distL="114300" distR="114300">
-            <wp:extent cx="5574665" cy="1878330"/>
-            <wp:effectExtent l="0" t="0" r="3175" b="11430"/>
-            <wp:docPr id="5" name="Picture 28"/>
-            <wp:cNvGraphicFramePr>
-              <a:graphicFrameLocks xmlns:a="http://schemas.openxmlformats.org/drawingml/2006/main" noChangeAspect="1"/>
-            </wp:cNvGraphicFramePr>
-            <a:graphic xmlns:a="http://schemas.openxmlformats.org/drawingml/2006/main">
-              <a:graphicData uri="http://schemas.openxmlformats.org/drawingml/2006/picture">
-                <pic:pic xmlns:pic="http://schemas.openxmlformats.org/drawingml/2006/picture">
-                  <pic:nvPicPr>
-                    <pic:cNvPr id="5" name="Picture 28"/>
-                    <pic:cNvPicPr>
-                      <a:picLocks noChangeAspect="1"/>
-                    </pic:cNvPicPr>
-                  </pic:nvPicPr>
-                  <pic:blipFill>
-                    <a:blip r:embed="rId13"/>
-                    <a:stretch>
-                      <a:fillRect/>
-                    </a:stretch>
-                  </pic:blipFill>
-                  <pic:spPr>
-                    <a:xfrm>
-                      <a:off x="0" y="0"/>
-                      <a:ext cx="5574665" cy="1878330"/>
-                    </a:xfrm>
-                    <a:prstGeom prst="rect">
-                      <a:avLst/>
-                    </a:prstGeom>
-                    <a:noFill/>
-                    <a:ln>
-                      <a:noFill/>
-                    </a:ln>
-                  </pic:spPr>
-                </pic:pic>
-              </a:graphicData>
-            </a:graphic>
-          </wp:inline>
-        </w:drawing>
-      </w:r>
+        <w:rPr>
+          <w:lang w:val="en-US"/>
+        </w:rPr>
+      </w:pPr>
     </w:p>
     <w:p>
       <w:pPr>
@@ -23567,7 +24622,14 @@
         <w:rPr>
           <w:lang w:val="vi-VN"/>
         </w:rPr>
-        <w:t xml:space="preserve"> some error patterns</w:t>
+        <w:t xml:space="preserve"> </w:t>
+      </w:r>
+      <w:r>
+        <w:rPr>
+          <w:rFonts w:hint="default"/>
+          <w:lang w:val="vi-VN"/>
+        </w:rPr>
+        <w:t>Error Category Distribution Statistics</w:t>
       </w:r>
     </w:p>
     <w:p>
@@ -24778,7 +25840,7 @@
           <w:rFonts w:hint="default"/>
           <w:lang w:val="en-US"/>
         </w:rPr>
-        <w:t>The OCR pipeline consists of three stages:</w:t>
+        <w:t>- The OCR pipeline consists of three stages:</w:t>
       </w:r>
     </w:p>
     <w:p>
@@ -24848,6 +25910,7 @@
       <w:pPr>
         <w:pStyle w:val="4"/>
         <w:numPr>
+          <w:ilvl w:val="0"/>
           <w:numId w:val="0"/>
         </w:numPr>
         <w:ind w:left="840" w:leftChars="0"/>
@@ -24862,6 +25925,41 @@
           <w:lang w:val="en-US"/>
         </w:rPr>
         <w:t xml:space="preserve">Note: PhoBERT was evaluated but disabled in the production pipeline. </w:t>
+      </w:r>
+    </w:p>
+    <w:p>
+      <w:pPr>
+        <w:pStyle w:val="4"/>
+        <w:numPr>
+          <w:ilvl w:val="0"/>
+          <w:numId w:val="0"/>
+        </w:numPr>
+        <w:ind w:left="840" w:leftChars="0"/>
+        <w:rPr>
+          <w:rFonts w:hint="default"/>
+          <w:lang w:val="en-US"/>
+        </w:rPr>
+      </w:pPr>
+    </w:p>
+    <w:p>
+      <w:pPr>
+        <w:pStyle w:val="4"/>
+        <w:numPr>
+          <w:ilvl w:val="0"/>
+          <w:numId w:val="0"/>
+        </w:numPr>
+        <w:ind w:firstLine="720" w:firstLineChars="0"/>
+        <w:rPr>
+          <w:rFonts w:hint="default"/>
+          <w:lang w:val="en-US"/>
+        </w:rPr>
+      </w:pPr>
+      <w:r>
+        <w:rPr>
+          <w:rFonts w:hint="default"/>
+          <w:lang w:val="en-US"/>
+        </w:rPr>
+        <w:t>- The AddressCorrector module modified 315 samples in the test set: it improved recognition for 218 samples (69.2%), was neutral for 24 samples (7.6%), and hurt 73 samples (23.2%). The improvements are concentrated on Vietnamese geographic entity names (province, district, ward), where minor OCR substitutions are corrected via Levenshtein distance fuzzy-matching within the detected province scope.</w:t>
       </w:r>
     </w:p>
     <w:p>
@@ -26252,20 +27350,238 @@
     <w:p>
       <w:pPr>
         <w:pStyle w:val="4"/>
-        <w:rPr>
-          <w:lang w:val="vi-VN"/>
-        </w:rPr>
-      </w:pPr>
-    </w:p>
-    <w:p>
-      <w:pPr>
-        <w:spacing w:before="0" w:after="200" w:line="276" w:lineRule="auto"/>
+        <w:ind w:left="0" w:leftChars="0" w:firstLine="0" w:firstLineChars="0"/>
+        <w:rPr>
+          <w:rFonts w:hint="default"/>
+          <w:lang w:val="en-US"/>
+        </w:rPr>
+      </w:pPr>
+      <w:r>
+        <w:rPr>
+          <w:rFonts w:hint="default"/>
+          <w:lang w:val="en-US"/>
+        </w:rPr>
+        <w:t xml:space="preserve">- </w:t>
+      </w:r>
+      <w:r>
+        <w:rPr>
+          <w:rFonts w:hint="default"/>
+          <w:b/>
+          <w:bCs/>
+          <w:lang w:val="en-US"/>
+        </w:rPr>
+        <w:t>RQ1</w:t>
+      </w:r>
+      <w:r>
+        <w:rPr>
+          <w:rFonts w:hint="default"/>
+          <w:lang w:val="en-US"/>
+        </w:rPr>
+        <w:t>: TrOCR achieves an overall CER of 2.86%, compared to VietOCR (TBD) and CRNN+CTC (TBD) on the same 4,477 test samples. The Transformer-based architecture significantly outperforms both traditional approaches, confirming H1.</w:t>
+      </w:r>
+    </w:p>
+    <w:p>
+      <w:pPr>
+        <w:pStyle w:val="4"/>
+        <w:ind w:left="0" w:leftChars="0" w:firstLine="0" w:firstLineChars="0"/>
+        <w:rPr>
+          <w:rFonts w:hint="default"/>
+          <w:lang w:val="en-US"/>
+        </w:rPr>
+      </w:pPr>
+      <w:r>
+        <w:rPr>
+          <w:rFonts w:hint="default"/>
+          <w:lang w:val="en-US"/>
+        </w:rPr>
+        <w:t xml:space="preserve">- </w:t>
+      </w:r>
+      <w:r>
+        <w:rPr>
+          <w:rFonts w:hint="default"/>
+          <w:b/>
+          <w:bCs/>
+          <w:lang w:val="en-US"/>
+        </w:rPr>
+        <w:t>RQ2</w:t>
+      </w:r>
+      <w:r>
+        <w:rPr>
+          <w:rFonts w:hint="default"/>
+          <w:lang w:val="en-US"/>
+        </w:rPr>
+        <w:t>: The proposed unified model achieves 1.17% CER on printed text and 10.57% CER on handwritten text simultaneously, with printed CER degradation limited to within 2 percentage points from the Stage 2a best. The multi-stage training strategy with EWC successfully prevents catastrophic forgetting, confirming H3.</w:t>
+      </w:r>
+    </w:p>
+    <w:p>
+      <w:pPr>
+        <w:pStyle w:val="4"/>
+        <w:ind w:left="0" w:leftChars="0" w:firstLine="0" w:firstLineChars="0"/>
+        <w:rPr>
+          <w:rFonts w:hint="default"/>
+          <w:lang w:val="en-US"/>
+        </w:rPr>
+      </w:pPr>
+      <w:r>
+        <w:rPr>
+          <w:rFonts w:hint="default"/>
+          <w:lang w:val="en-US"/>
+        </w:rPr>
+        <w:t xml:space="preserve">- </w:t>
+      </w:r>
+      <w:r>
+        <w:rPr>
+          <w:rFonts w:hint="default"/>
+          <w:b/>
+          <w:bCs/>
+          <w:lang w:val="en-US"/>
+        </w:rPr>
+        <w:t>RQ3</w:t>
+      </w:r>
+      <w:r>
+        <w:rPr>
+          <w:rFonts w:hint="default"/>
+          <w:lang w:val="en-US"/>
+        </w:rPr>
+        <w:t>: The TrOCR model (~337M parameters) achieves 2.1 FPS on an NVIDIA L4 GPU, compared to [VietOCR FPS] and [CRNN FPS]. While the Transformer-based model requires more computational resources, the accuracy improvement justifies the cost for document digitization applications where recognition quality is prioritized over throughput.</w:t>
+      </w:r>
+    </w:p>
+    <w:p>
+      <w:pPr>
+        <w:pStyle w:val="4"/>
+        <w:ind w:left="0" w:leftChars="0" w:firstLine="0" w:firstLineChars="0"/>
+        <w:rPr>
+          <w:rFonts w:hint="default"/>
+          <w:lang w:val="en-US"/>
+        </w:rPr>
+      </w:pPr>
+    </w:p>
+    <w:p>
+      <w:pPr>
+        <w:pStyle w:val="3"/>
+        <w:bidi w:val="0"/>
+        <w:rPr>
+          <w:rFonts w:hint="default"/>
+          <w:lang w:val="en-US"/>
+        </w:rPr>
+      </w:pPr>
+      <w:r>
+        <w:rPr>
+          <w:rStyle w:val="28"/>
+          <w:rFonts w:hint="default"/>
+          <w:b/>
+          <w:lang w:val="en-US"/>
+        </w:rPr>
+        <w:t>Future work</w:t>
+      </w:r>
+    </w:p>
+    <w:p>
+      <w:pPr>
+        <w:pStyle w:val="4"/>
+        <w:numPr>
+          <w:ilvl w:val="0"/>
+          <w:numId w:val="104"/>
+        </w:numPr>
+        <w:ind w:leftChars="0"/>
+        <w:rPr>
+          <w:rFonts w:hint="default"/>
+          <w:lang w:val="en-US"/>
+        </w:rPr>
+      </w:pPr>
+      <w:r>
+        <w:rPr>
+          <w:rFonts w:hint="default"/>
+          <w:lang w:val="en-US"/>
+        </w:rPr>
+        <w:t>Stage 3 Paragraph Adaptation: The architecture for paragraph-level recognition has been implemented but not executed due to data constraints. Future work should prepare paragraph-level LMDB datasets and enable Stage 3 training to extend the model's capability to multi-line recognition.</w:t>
+      </w:r>
+    </w:p>
+    <w:p>
+      <w:pPr>
+        <w:pStyle w:val="4"/>
+        <w:numPr>
+          <w:ilvl w:val="0"/>
+          <w:numId w:val="104"/>
+        </w:numPr>
+        <w:ind w:left="0" w:leftChars="0" w:firstLine="720" w:firstLineChars="0"/>
+        <w:rPr>
+          <w:rFonts w:hint="default"/>
+          <w:lang w:val="en-US"/>
+        </w:rPr>
+      </w:pPr>
+      <w:r>
+        <w:rPr>
+          <w:rFonts w:hint="default"/>
+          <w:lang w:val="en-US"/>
+        </w:rPr>
+        <w:t>Improved Decoding Strategies: The current greedy decoding with repetition penalty could be enhanced with constrained beam search using Vietnamese language model scores, avoiding the n-gram conflicts identified in this study.</w:t>
+      </w:r>
+    </w:p>
+    <w:p>
+      <w:pPr>
+        <w:pStyle w:val="4"/>
+        <w:numPr>
+          <w:ilvl w:val="0"/>
+          <w:numId w:val="104"/>
+        </w:numPr>
+        <w:ind w:left="0" w:leftChars="0" w:firstLine="720" w:firstLineChars="0"/>
+        <w:rPr>
+          <w:rFonts w:hint="default"/>
+          <w:lang w:val="en-US"/>
+        </w:rPr>
+      </w:pPr>
+      <w:r>
+        <w:rPr>
+          <w:rFonts w:hint="default"/>
+          <w:lang w:val="en-US"/>
+        </w:rPr>
+        <w:t>PhoBERT Integration: The current MLM rescoring approach was shown to be net negative. Future work could explore sequence-level PhoBERT rescoring or fine-tuning PhoBERT specifically on OCR error patterns.</w:t>
+      </w:r>
+    </w:p>
+    <w:p>
+      <w:pPr>
+        <w:pStyle w:val="4"/>
+        <w:numPr>
+          <w:ilvl w:val="0"/>
+          <w:numId w:val="104"/>
+        </w:numPr>
+        <w:ind w:left="0" w:leftChars="0" w:firstLine="720" w:firstLineChars="0"/>
+        <w:rPr>
+          <w:rFonts w:hint="default"/>
+          <w:lang w:val="en-US"/>
+        </w:rPr>
+      </w:pPr>
+      <w:r>
+        <w:rPr>
+          <w:rFonts w:hint="default"/>
+          <w:lang w:val="en-US"/>
+        </w:rPr>
+        <w:t>Real-world Deployment: The Gradio-based interface demonstrates feasibility, but production deployment would benefit from model quantization (INT8) and batch processing optimization.</w:t>
+      </w:r>
+    </w:p>
+    <w:p>
+      <w:pPr>
+        <w:pStyle w:val="4"/>
+        <w:numPr>
+          <w:ilvl w:val="0"/>
+          <w:numId w:val="104"/>
+        </w:numPr>
+        <w:ind w:left="0" w:leftChars="0" w:firstLine="720" w:firstLineChars="0"/>
         <w:rPr>
           <w:sz w:val="26"/>
           <w:szCs w:val="26"/>
           <w:lang w:val="vi-VN"/>
         </w:rPr>
       </w:pPr>
+      <w:bookmarkStart w:id="107" w:name="_GoBack"/>
+      <w:bookmarkEnd w:id="107"/>
+      <w:r>
+        <w:rPr>
+          <w:rFonts w:hint="default"/>
+          <w:lang w:val="en-US"/>
+        </w:rPr>
+        <w:t>Dataset Expansion: The handwritten validation set (549 samples) is small and causes high CER variance. Expanding this set would improve evaluation reliability."</w:t>
+      </w:r>
       <w:r>
         <w:rPr>
           <w:lang w:val="vi-VN"/>
@@ -27681,6 +28997,18 @@
     </w:lvl>
   </w:abstractNum>
   <w:abstractNum w:abstractNumId="41">
+    <w:nsid w:val="E33D1C8E"/>
+    <w:multiLevelType w:val="singleLevel"/>
+    <w:tmpl w:val="E33D1C8E"/>
+    <w:lvl w:ilvl="0" w:tentative="0">
+      <w:start w:val="1"/>
+      <w:numFmt w:val="decimal"/>
+      <w:suff w:val="space"/>
+      <w:lvlText w:val="%1."/>
+      <w:lvlJc w:val="left"/>
+    </w:lvl>
+  </w:abstractNum>
+  <w:abstractNum w:abstractNumId="42">
     <w:nsid w:val="E7CC3FCC"/>
     <w:multiLevelType w:val="singleLevel"/>
     <w:tmpl w:val="E7CC3FCC"/>
@@ -27700,7 +29028,7 @@
       </w:rPr>
     </w:lvl>
   </w:abstractNum>
-  <w:abstractNum w:abstractNumId="42">
+  <w:abstractNum w:abstractNumId="43">
     <w:nsid w:val="ED722F64"/>
     <w:multiLevelType w:val="singleLevel"/>
     <w:tmpl w:val="ED722F64"/>
@@ -27720,7 +29048,7 @@
       </w:rPr>
     </w:lvl>
   </w:abstractNum>
-  <w:abstractNum w:abstractNumId="43">
+  <w:abstractNum w:abstractNumId="44">
     <w:nsid w:val="EF46D5CF"/>
     <w:multiLevelType w:val="singleLevel"/>
     <w:tmpl w:val="EF46D5CF"/>
@@ -27740,7 +29068,7 @@
       </w:rPr>
     </w:lvl>
   </w:abstractNum>
-  <w:abstractNum w:abstractNumId="44">
+  <w:abstractNum w:abstractNumId="45">
     <w:nsid w:val="F1551C93"/>
     <w:multiLevelType w:val="singleLevel"/>
     <w:tmpl w:val="F1551C93"/>
@@ -27760,7 +29088,7 @@
       </w:rPr>
     </w:lvl>
   </w:abstractNum>
-  <w:abstractNum w:abstractNumId="45">
+  <w:abstractNum w:abstractNumId="46">
     <w:nsid w:val="F1FF374F"/>
     <w:multiLevelType w:val="singleLevel"/>
     <w:tmpl w:val="F1FF374F"/>
@@ -27780,7 +29108,7 @@
       </w:rPr>
     </w:lvl>
   </w:abstractNum>
-  <w:abstractNum w:abstractNumId="46">
+  <w:abstractNum w:abstractNumId="47">
     <w:nsid w:val="F2579E83"/>
     <w:multiLevelType w:val="singleLevel"/>
     <w:tmpl w:val="F2579E83"/>
@@ -27800,7 +29128,7 @@
       </w:rPr>
     </w:lvl>
   </w:abstractNum>
-  <w:abstractNum w:abstractNumId="47">
+  <w:abstractNum w:abstractNumId="48">
     <w:nsid w:val="F5B9BF04"/>
     <w:multiLevelType w:val="multilevel"/>
     <w:tmpl w:val="F5B9BF04"/>
@@ -27940,7 +29268,7 @@
       </w:rPr>
     </w:lvl>
   </w:abstractNum>
-  <w:abstractNum w:abstractNumId="48">
+  <w:abstractNum w:abstractNumId="49">
     <w:nsid w:val="F653F389"/>
     <w:multiLevelType w:val="singleLevel"/>
     <w:tmpl w:val="F653F389"/>
@@ -27960,7 +29288,7 @@
       </w:rPr>
     </w:lvl>
   </w:abstractNum>
-  <w:abstractNum w:abstractNumId="49">
+  <w:abstractNum w:abstractNumId="50">
     <w:nsid w:val="F890B549"/>
     <w:multiLevelType w:val="singleLevel"/>
     <w:tmpl w:val="F890B549"/>
@@ -27980,7 +29308,7 @@
       </w:rPr>
     </w:lvl>
   </w:abstractNum>
-  <w:abstractNum w:abstractNumId="50">
+  <w:abstractNum w:abstractNumId="51">
     <w:nsid w:val="F8E57D2E"/>
     <w:multiLevelType w:val="singleLevel"/>
     <w:tmpl w:val="F8E57D2E"/>
@@ -28000,7 +29328,7 @@
       </w:rPr>
     </w:lvl>
   </w:abstractNum>
-  <w:abstractNum w:abstractNumId="51">
+  <w:abstractNum w:abstractNumId="52">
     <w:nsid w:val="FA404AB4"/>
     <w:multiLevelType w:val="singleLevel"/>
     <w:tmpl w:val="FA404AB4"/>
@@ -28020,7 +29348,7 @@
       </w:rPr>
     </w:lvl>
   </w:abstractNum>
-  <w:abstractNum w:abstractNumId="52">
+  <w:abstractNum w:abstractNumId="53">
     <w:nsid w:val="02CFC1CA"/>
     <w:multiLevelType w:val="singleLevel"/>
     <w:tmpl w:val="02CFC1CA"/>
@@ -28040,7 +29368,7 @@
       </w:rPr>
     </w:lvl>
   </w:abstractNum>
-  <w:abstractNum w:abstractNumId="53">
+  <w:abstractNum w:abstractNumId="54">
     <w:nsid w:val="02DA0CD7"/>
     <w:multiLevelType w:val="singleLevel"/>
     <w:tmpl w:val="02DA0CD7"/>
@@ -28060,7 +29388,7 @@
       </w:rPr>
     </w:lvl>
   </w:abstractNum>
-  <w:abstractNum w:abstractNumId="54">
+  <w:abstractNum w:abstractNumId="55">
     <w:nsid w:val="0385AE7E"/>
     <w:multiLevelType w:val="singleLevel"/>
     <w:tmpl w:val="0385AE7E"/>
@@ -28080,7 +29408,7 @@
       </w:rPr>
     </w:lvl>
   </w:abstractNum>
-  <w:abstractNum w:abstractNumId="55">
+  <w:abstractNum w:abstractNumId="56">
     <w:nsid w:val="0E0423D4"/>
     <w:multiLevelType w:val="singleLevel"/>
     <w:tmpl w:val="0E0423D4"/>
@@ -28100,7 +29428,7 @@
       </w:rPr>
     </w:lvl>
   </w:abstractNum>
-  <w:abstractNum w:abstractNumId="56">
+  <w:abstractNum w:abstractNumId="57">
     <w:nsid w:val="121724AE"/>
     <w:multiLevelType w:val="multilevel"/>
     <w:tmpl w:val="121724AE"/>
@@ -28226,7 +29554,7 @@
       </w:rPr>
     </w:lvl>
   </w:abstractNum>
-  <w:abstractNum w:abstractNumId="57">
+  <w:abstractNum w:abstractNumId="58">
     <w:nsid w:val="16F30CA3"/>
     <w:multiLevelType w:val="singleLevel"/>
     <w:tmpl w:val="16F30CA3"/>
@@ -28246,7 +29574,7 @@
       </w:rPr>
     </w:lvl>
   </w:abstractNum>
-  <w:abstractNum w:abstractNumId="58">
+  <w:abstractNum w:abstractNumId="59">
     <w:nsid w:val="193124B1"/>
     <w:multiLevelType w:val="singleLevel"/>
     <w:tmpl w:val="193124B1"/>
@@ -28266,7 +29594,7 @@
       </w:rPr>
     </w:lvl>
   </w:abstractNum>
-  <w:abstractNum w:abstractNumId="59">
+  <w:abstractNum w:abstractNumId="60">
     <w:nsid w:val="1BAA0833"/>
     <w:multiLevelType w:val="multilevel"/>
     <w:tmpl w:val="1BAA0833"/>
@@ -28406,7 +29734,7 @@
       </w:rPr>
     </w:lvl>
   </w:abstractNum>
-  <w:abstractNum w:abstractNumId="60">
+  <w:abstractNum w:abstractNumId="61">
     <w:nsid w:val="23DCE7E9"/>
     <w:multiLevelType w:val="singleLevel"/>
     <w:tmpl w:val="23DCE7E9"/>
@@ -28426,7 +29754,7 @@
       </w:rPr>
     </w:lvl>
   </w:abstractNum>
-  <w:abstractNum w:abstractNumId="61">
+  <w:abstractNum w:abstractNumId="62">
     <w:nsid w:val="23F5FCAA"/>
     <w:multiLevelType w:val="singleLevel"/>
     <w:tmpl w:val="23F5FCAA"/>
@@ -28446,7 +29774,7 @@
       </w:rPr>
     </w:lvl>
   </w:abstractNum>
-  <w:abstractNum w:abstractNumId="62">
+  <w:abstractNum w:abstractNumId="63">
     <w:nsid w:val="27147626"/>
     <w:multiLevelType w:val="singleLevel"/>
     <w:tmpl w:val="27147626"/>
@@ -28466,7 +29794,7 @@
       </w:rPr>
     </w:lvl>
   </w:abstractNum>
-  <w:abstractNum w:abstractNumId="63">
+  <w:abstractNum w:abstractNumId="64">
     <w:nsid w:val="28648450"/>
     <w:multiLevelType w:val="singleLevel"/>
     <w:tmpl w:val="28648450"/>
@@ -28486,7 +29814,7 @@
       </w:rPr>
     </w:lvl>
   </w:abstractNum>
-  <w:abstractNum w:abstractNumId="64">
+  <w:abstractNum w:abstractNumId="65">
     <w:nsid w:val="2ACB8761"/>
     <w:multiLevelType w:val="singleLevel"/>
     <w:tmpl w:val="2ACB8761"/>
@@ -28506,7 +29834,7 @@
       </w:rPr>
     </w:lvl>
   </w:abstractNum>
-  <w:abstractNum w:abstractNumId="65">
+  <w:abstractNum w:abstractNumId="66">
     <w:nsid w:val="2B975F81"/>
     <w:multiLevelType w:val="singleLevel"/>
     <w:tmpl w:val="2B975F81"/>
@@ -28526,7 +29854,7 @@
       </w:rPr>
     </w:lvl>
   </w:abstractNum>
-  <w:abstractNum w:abstractNumId="66">
+  <w:abstractNum w:abstractNumId="67">
     <w:nsid w:val="2CEFF588"/>
     <w:multiLevelType w:val="singleLevel"/>
     <w:tmpl w:val="2CEFF588"/>
@@ -28548,7 +29876,7 @@
       </w:rPr>
     </w:lvl>
   </w:abstractNum>
-  <w:abstractNum w:abstractNumId="67">
+  <w:abstractNum w:abstractNumId="68">
     <w:nsid w:val="2D63C4AF"/>
     <w:multiLevelType w:val="singleLevel"/>
     <w:tmpl w:val="2D63C4AF"/>
@@ -28568,7 +29896,7 @@
       </w:rPr>
     </w:lvl>
   </w:abstractNum>
-  <w:abstractNum w:abstractNumId="68">
+  <w:abstractNum w:abstractNumId="69">
     <w:nsid w:val="2E366A94"/>
     <w:multiLevelType w:val="singleLevel"/>
     <w:tmpl w:val="2E366A94"/>
@@ -28588,7 +29916,7 @@
       </w:rPr>
     </w:lvl>
   </w:abstractNum>
-  <w:abstractNum w:abstractNumId="69">
+  <w:abstractNum w:abstractNumId="70">
     <w:nsid w:val="308D6878"/>
     <w:multiLevelType w:val="singleLevel"/>
     <w:tmpl w:val="308D6878"/>
@@ -28608,7 +29936,7 @@
       </w:rPr>
     </w:lvl>
   </w:abstractNum>
-  <w:abstractNum w:abstractNumId="70">
+  <w:abstractNum w:abstractNumId="71">
     <w:nsid w:val="3719B40D"/>
     <w:multiLevelType w:val="singleLevel"/>
     <w:tmpl w:val="3719B40D"/>
@@ -28628,7 +29956,7 @@
       </w:rPr>
     </w:lvl>
   </w:abstractNum>
-  <w:abstractNum w:abstractNumId="71">
+  <w:abstractNum w:abstractNumId="72">
     <w:nsid w:val="38984F8B"/>
     <w:multiLevelType w:val="singleLevel"/>
     <w:tmpl w:val="38984F8B"/>
@@ -28648,7 +29976,7 @@
       </w:rPr>
     </w:lvl>
   </w:abstractNum>
-  <w:abstractNum w:abstractNumId="72">
+  <w:abstractNum w:abstractNumId="73">
     <w:nsid w:val="393FCE40"/>
     <w:multiLevelType w:val="singleLevel"/>
     <w:tmpl w:val="393FCE40"/>
@@ -28668,7 +29996,7 @@
       </w:rPr>
     </w:lvl>
   </w:abstractNum>
-  <w:abstractNum w:abstractNumId="73">
+  <w:abstractNum w:abstractNumId="74">
     <w:nsid w:val="3A31BE9B"/>
     <w:multiLevelType w:val="singleLevel"/>
     <w:tmpl w:val="3A31BE9B"/>
@@ -28688,7 +30016,7 @@
       </w:rPr>
     </w:lvl>
   </w:abstractNum>
-  <w:abstractNum w:abstractNumId="74">
+  <w:abstractNum w:abstractNumId="75">
     <w:nsid w:val="3A73AE29"/>
     <w:multiLevelType w:val="singleLevel"/>
     <w:tmpl w:val="3A73AE29"/>
@@ -28708,7 +30036,7 @@
       </w:rPr>
     </w:lvl>
   </w:abstractNum>
-  <w:abstractNum w:abstractNumId="75">
+  <w:abstractNum w:abstractNumId="76">
     <w:nsid w:val="3D7A74FE"/>
     <w:multiLevelType w:val="singleLevel"/>
     <w:tmpl w:val="3D7A74FE"/>
@@ -28728,7 +30056,7 @@
       </w:rPr>
     </w:lvl>
   </w:abstractNum>
-  <w:abstractNum w:abstractNumId="76">
+  <w:abstractNum w:abstractNumId="77">
     <w:nsid w:val="40903546"/>
     <w:multiLevelType w:val="singleLevel"/>
     <w:tmpl w:val="40903546"/>
@@ -28748,7 +30076,7 @@
       </w:rPr>
     </w:lvl>
   </w:abstractNum>
-  <w:abstractNum w:abstractNumId="77">
+  <w:abstractNum w:abstractNumId="78">
     <w:nsid w:val="43BC0DB5"/>
     <w:multiLevelType w:val="singleLevel"/>
     <w:tmpl w:val="43BC0DB5"/>
@@ -28768,7 +30096,7 @@
       </w:rPr>
     </w:lvl>
   </w:abstractNum>
-  <w:abstractNum w:abstractNumId="78">
+  <w:abstractNum w:abstractNumId="79">
     <w:nsid w:val="46446F78"/>
     <w:multiLevelType w:val="singleLevel"/>
     <w:tmpl w:val="46446F78"/>
@@ -28788,7 +30116,7 @@
       </w:rPr>
     </w:lvl>
   </w:abstractNum>
-  <w:abstractNum w:abstractNumId="79">
+  <w:abstractNum w:abstractNumId="80">
     <w:nsid w:val="46763076"/>
     <w:multiLevelType w:val="singleLevel"/>
     <w:tmpl w:val="46763076"/>
@@ -28808,7 +30136,7 @@
       </w:rPr>
     </w:lvl>
   </w:abstractNum>
-  <w:abstractNum w:abstractNumId="80">
+  <w:abstractNum w:abstractNumId="81">
     <w:nsid w:val="496F9350"/>
     <w:multiLevelType w:val="singleLevel"/>
     <w:tmpl w:val="496F9350"/>
@@ -28828,7 +30156,7 @@
       </w:rPr>
     </w:lvl>
   </w:abstractNum>
-  <w:abstractNum w:abstractNumId="81">
+  <w:abstractNum w:abstractNumId="82">
     <w:nsid w:val="4C54E0E7"/>
     <w:multiLevelType w:val="singleLevel"/>
     <w:tmpl w:val="4C54E0E7"/>
@@ -28848,7 +30176,7 @@
       </w:rPr>
     </w:lvl>
   </w:abstractNum>
-  <w:abstractNum w:abstractNumId="82">
+  <w:abstractNum w:abstractNumId="83">
     <w:nsid w:val="4FC931E5"/>
     <w:multiLevelType w:val="singleLevel"/>
     <w:tmpl w:val="4FC931E5"/>
@@ -28868,7 +30196,7 @@
       </w:rPr>
     </w:lvl>
   </w:abstractNum>
-  <w:abstractNum w:abstractNumId="83">
+  <w:abstractNum w:abstractNumId="84">
     <w:nsid w:val="508517A0"/>
     <w:multiLevelType w:val="singleLevel"/>
     <w:tmpl w:val="508517A0"/>
@@ -28888,7 +30216,7 @@
       </w:rPr>
     </w:lvl>
   </w:abstractNum>
-  <w:abstractNum w:abstractNumId="84">
+  <w:abstractNum w:abstractNumId="85">
     <w:nsid w:val="52EE4250"/>
     <w:multiLevelType w:val="singleLevel"/>
     <w:tmpl w:val="52EE4250"/>
@@ -28908,7 +30236,7 @@
       </w:rPr>
     </w:lvl>
   </w:abstractNum>
-  <w:abstractNum w:abstractNumId="85">
+  <w:abstractNum w:abstractNumId="86">
     <w:nsid w:val="53845147"/>
     <w:multiLevelType w:val="singleLevel"/>
     <w:tmpl w:val="53845147"/>
@@ -28928,7 +30256,7 @@
       </w:rPr>
     </w:lvl>
   </w:abstractNum>
-  <w:abstractNum w:abstractNumId="86">
+  <w:abstractNum w:abstractNumId="87">
     <w:nsid w:val="58852B25"/>
     <w:multiLevelType w:val="singleLevel"/>
     <w:tmpl w:val="58852B25"/>
@@ -28948,7 +30276,7 @@
       </w:rPr>
     </w:lvl>
   </w:abstractNum>
-  <w:abstractNum w:abstractNumId="87">
+  <w:abstractNum w:abstractNumId="88">
     <w:nsid w:val="590E398E"/>
     <w:multiLevelType w:val="singleLevel"/>
     <w:tmpl w:val="590E398E"/>
@@ -28968,7 +30296,7 @@
       </w:rPr>
     </w:lvl>
   </w:abstractNum>
-  <w:abstractNum w:abstractNumId="88">
+  <w:abstractNum w:abstractNumId="89">
     <w:nsid w:val="5F25CA6B"/>
     <w:multiLevelType w:val="singleLevel"/>
     <w:tmpl w:val="5F25CA6B"/>
@@ -28988,7 +30316,7 @@
       </w:rPr>
     </w:lvl>
   </w:abstractNum>
-  <w:abstractNum w:abstractNumId="89">
+  <w:abstractNum w:abstractNumId="90">
     <w:nsid w:val="5FAB966C"/>
     <w:multiLevelType w:val="singleLevel"/>
     <w:tmpl w:val="5FAB966C"/>
@@ -29008,7 +30336,7 @@
       </w:rPr>
     </w:lvl>
   </w:abstractNum>
-  <w:abstractNum w:abstractNumId="90">
+  <w:abstractNum w:abstractNumId="91">
     <w:nsid w:val="607140C9"/>
     <w:multiLevelType w:val="singleLevel"/>
     <w:tmpl w:val="607140C9"/>
@@ -29028,7 +30356,7 @@
       </w:rPr>
     </w:lvl>
   </w:abstractNum>
-  <w:abstractNum w:abstractNumId="91">
+  <w:abstractNum w:abstractNumId="92">
     <w:nsid w:val="615C5B68"/>
     <w:multiLevelType w:val="singleLevel"/>
     <w:tmpl w:val="615C5B68"/>
@@ -29048,7 +30376,7 @@
       </w:rPr>
     </w:lvl>
   </w:abstractNum>
-  <w:abstractNum w:abstractNumId="92">
+  <w:abstractNum w:abstractNumId="93">
     <w:nsid w:val="62BDF618"/>
     <w:multiLevelType w:val="singleLevel"/>
     <w:tmpl w:val="62BDF618"/>
@@ -29068,7 +30396,7 @@
       </w:rPr>
     </w:lvl>
   </w:abstractNum>
-  <w:abstractNum w:abstractNumId="93">
+  <w:abstractNum w:abstractNumId="94">
     <w:nsid w:val="648DBBE3"/>
     <w:multiLevelType w:val="singleLevel"/>
     <w:tmpl w:val="648DBBE3"/>
@@ -29088,7 +30416,7 @@
       </w:rPr>
     </w:lvl>
   </w:abstractNum>
-  <w:abstractNum w:abstractNumId="94">
+  <w:abstractNum w:abstractNumId="95">
     <w:nsid w:val="64CAED3C"/>
     <w:multiLevelType w:val="singleLevel"/>
     <w:tmpl w:val="64CAED3C"/>
@@ -29108,7 +30436,7 @@
       </w:rPr>
     </w:lvl>
   </w:abstractNum>
-  <w:abstractNum w:abstractNumId="95">
+  <w:abstractNum w:abstractNumId="96">
     <w:nsid w:val="6738FE64"/>
     <w:multiLevelType w:val="singleLevel"/>
     <w:tmpl w:val="6738FE64"/>
@@ -29128,7 +30456,7 @@
       </w:rPr>
     </w:lvl>
   </w:abstractNum>
-  <w:abstractNum w:abstractNumId="96">
+  <w:abstractNum w:abstractNumId="97">
     <w:nsid w:val="6863F05D"/>
     <w:multiLevelType w:val="singleLevel"/>
     <w:tmpl w:val="6863F05D"/>
@@ -29148,7 +30476,7 @@
       </w:rPr>
     </w:lvl>
   </w:abstractNum>
-  <w:abstractNum w:abstractNumId="97">
+  <w:abstractNum w:abstractNumId="98">
     <w:nsid w:val="6D549DD9"/>
     <w:multiLevelType w:val="singleLevel"/>
     <w:tmpl w:val="6D549DD9"/>
@@ -29168,7 +30496,7 @@
       </w:rPr>
     </w:lvl>
   </w:abstractNum>
-  <w:abstractNum w:abstractNumId="98">
+  <w:abstractNum w:abstractNumId="99">
     <w:nsid w:val="6DAE3915"/>
     <w:multiLevelType w:val="singleLevel"/>
     <w:tmpl w:val="6DAE3915"/>
@@ -29188,7 +30516,7 @@
       </w:rPr>
     </w:lvl>
   </w:abstractNum>
-  <w:abstractNum w:abstractNumId="99">
+  <w:abstractNum w:abstractNumId="100">
     <w:nsid w:val="7079D556"/>
     <w:multiLevelType w:val="singleLevel"/>
     <w:tmpl w:val="7079D556"/>
@@ -29208,7 +30536,7 @@
       </w:rPr>
     </w:lvl>
   </w:abstractNum>
-  <w:abstractNum w:abstractNumId="100">
+  <w:abstractNum w:abstractNumId="101">
     <w:nsid w:val="72572A6D"/>
     <w:multiLevelType w:val="singleLevel"/>
     <w:tmpl w:val="72572A6D"/>
@@ -29228,7 +30556,7 @@
       </w:rPr>
     </w:lvl>
   </w:abstractNum>
-  <w:abstractNum w:abstractNumId="101">
+  <w:abstractNum w:abstractNumId="102">
     <w:nsid w:val="795FA38E"/>
     <w:multiLevelType w:val="singleLevel"/>
     <w:tmpl w:val="795FA38E"/>
@@ -29248,7 +30576,7 @@
       </w:rPr>
     </w:lvl>
   </w:abstractNum>
-  <w:abstractNum w:abstractNumId="102">
+  <w:abstractNum w:abstractNumId="103">
     <w:nsid w:val="7DD4C610"/>
     <w:multiLevelType w:val="singleLevel"/>
     <w:tmpl w:val="7DD4C610"/>
@@ -29269,13 +30597,13 @@
     </w:lvl>
   </w:abstractNum>
   <w:num w:numId="1">
-    <w:abstractNumId w:val="56"/>
+    <w:abstractNumId w:val="57"/>
   </w:num>
   <w:num w:numId="2">
-    <w:abstractNumId w:val="54"/>
+    <w:abstractNumId w:val="55"/>
   </w:num>
   <w:num w:numId="3">
-    <w:abstractNumId w:val="96"/>
+    <w:abstractNumId w:val="97"/>
   </w:num>
   <w:num w:numId="4">
     <w:abstractNumId w:val="32"/>
@@ -29287,40 +30615,40 @@
     <w:abstractNumId w:val="14"/>
   </w:num>
   <w:num w:numId="7">
-    <w:abstractNumId w:val="78"/>
+    <w:abstractNumId w:val="79"/>
   </w:num>
   <w:num w:numId="8">
-    <w:abstractNumId w:val="47"/>
+    <w:abstractNumId w:val="48"/>
   </w:num>
   <w:num w:numId="9">
-    <w:abstractNumId w:val="50"/>
+    <w:abstractNumId w:val="51"/>
   </w:num>
   <w:num w:numId="10">
-    <w:abstractNumId w:val="75"/>
+    <w:abstractNumId w:val="76"/>
   </w:num>
   <w:num w:numId="11">
     <w:abstractNumId w:val="0"/>
   </w:num>
   <w:num w:numId="12">
-    <w:abstractNumId w:val="61"/>
+    <w:abstractNumId w:val="62"/>
   </w:num>
   <w:num w:numId="13">
     <w:abstractNumId w:val="36"/>
   </w:num>
   <w:num w:numId="14">
-    <w:abstractNumId w:val="70"/>
+    <w:abstractNumId w:val="71"/>
   </w:num>
   <w:num w:numId="15">
-    <w:abstractNumId w:val="93"/>
+    <w:abstractNumId w:val="94"/>
   </w:num>
   <w:num w:numId="16">
-    <w:abstractNumId w:val="87"/>
+    <w:abstractNumId w:val="88"/>
   </w:num>
   <w:num w:numId="17">
-    <w:abstractNumId w:val="91"/>
+    <w:abstractNumId w:val="92"/>
   </w:num>
   <w:num w:numId="18">
-    <w:abstractNumId w:val="80"/>
+    <w:abstractNumId w:val="81"/>
   </w:num>
   <w:num w:numId="19">
     <w:abstractNumId w:val="34"/>
@@ -29329,34 +30657,34 @@
     <w:abstractNumId w:val="3"/>
   </w:num>
   <w:num w:numId="21">
-    <w:abstractNumId w:val="100"/>
+    <w:abstractNumId w:val="101"/>
   </w:num>
   <w:num w:numId="22">
-    <w:abstractNumId w:val="99"/>
+    <w:abstractNumId w:val="100"/>
   </w:num>
   <w:num w:numId="23">
     <w:abstractNumId w:val="22"/>
   </w:num>
   <w:num w:numId="24">
-    <w:abstractNumId w:val="43"/>
+    <w:abstractNumId w:val="44"/>
   </w:num>
   <w:num w:numId="25">
     <w:abstractNumId w:val="29"/>
   </w:num>
   <w:num w:numId="26">
-    <w:abstractNumId w:val="45"/>
+    <w:abstractNumId w:val="46"/>
   </w:num>
   <w:num w:numId="27">
-    <w:abstractNumId w:val="101"/>
+    <w:abstractNumId w:val="102"/>
   </w:num>
   <w:num w:numId="28">
-    <w:abstractNumId w:val="46"/>
+    <w:abstractNumId w:val="47"/>
   </w:num>
   <w:num w:numId="29">
-    <w:abstractNumId w:val="88"/>
+    <w:abstractNumId w:val="89"/>
   </w:num>
   <w:num w:numId="30">
-    <w:abstractNumId w:val="77"/>
+    <w:abstractNumId w:val="78"/>
   </w:num>
   <w:num w:numId="31">
     <w:abstractNumId w:val="17"/>
@@ -29365,19 +30693,19 @@
     <w:abstractNumId w:val="7"/>
   </w:num>
   <w:num w:numId="33">
-    <w:abstractNumId w:val="48"/>
+    <w:abstractNumId w:val="49"/>
   </w:num>
   <w:num w:numId="34">
-    <w:abstractNumId w:val="94"/>
+    <w:abstractNumId w:val="95"/>
   </w:num>
   <w:num w:numId="35">
-    <w:abstractNumId w:val="68"/>
+    <w:abstractNumId w:val="69"/>
   </w:num>
   <w:num w:numId="36">
-    <w:abstractNumId w:val="79"/>
+    <w:abstractNumId w:val="80"/>
   </w:num>
   <w:num w:numId="37">
-    <w:abstractNumId w:val="55"/>
+    <w:abstractNumId w:val="56"/>
   </w:num>
   <w:num w:numId="38">
     <w:abstractNumId w:val="24"/>
@@ -29389,16 +30717,16 @@
     <w:abstractNumId w:val="31"/>
   </w:num>
   <w:num w:numId="41">
-    <w:abstractNumId w:val="74"/>
+    <w:abstractNumId w:val="75"/>
   </w:num>
   <w:num w:numId="42">
-    <w:abstractNumId w:val="95"/>
+    <w:abstractNumId w:val="96"/>
   </w:num>
   <w:num w:numId="43">
-    <w:abstractNumId w:val="69"/>
+    <w:abstractNumId w:val="70"/>
   </w:num>
   <w:num w:numId="44">
-    <w:abstractNumId w:val="62"/>
+    <w:abstractNumId w:val="63"/>
   </w:num>
   <w:num w:numId="45">
     <w:abstractNumId w:val="16"/>
@@ -29410,10 +30738,10 @@
     <w:abstractNumId w:val="38"/>
   </w:num>
   <w:num w:numId="48">
-    <w:abstractNumId w:val="81"/>
+    <w:abstractNumId w:val="82"/>
   </w:num>
   <w:num w:numId="49">
-    <w:abstractNumId w:val="86"/>
+    <w:abstractNumId w:val="87"/>
   </w:num>
   <w:num w:numId="50">
     <w:abstractNumId w:val="37"/>
@@ -29422,31 +30750,31 @@
     <w:abstractNumId w:val="9"/>
   </w:num>
   <w:num w:numId="52">
-    <w:abstractNumId w:val="52"/>
+    <w:abstractNumId w:val="53"/>
   </w:num>
   <w:num w:numId="53">
     <w:abstractNumId w:val="30"/>
   </w:num>
   <w:num w:numId="54">
-    <w:abstractNumId w:val="73"/>
+    <w:abstractNumId w:val="74"/>
   </w:num>
   <w:num w:numId="55">
+    <w:abstractNumId w:val="85"/>
+  </w:num>
+  <w:num w:numId="56">
+    <w:abstractNumId w:val="61"/>
+  </w:num>
+  <w:num w:numId="57">
     <w:abstractNumId w:val="84"/>
   </w:num>
-  <w:num w:numId="56">
-    <w:abstractNumId w:val="60"/>
-  </w:num>
-  <w:num w:numId="57">
-    <w:abstractNumId w:val="83"/>
-  </w:num>
   <w:num w:numId="58">
-    <w:abstractNumId w:val="71"/>
+    <w:abstractNumId w:val="72"/>
   </w:num>
   <w:num w:numId="59">
-    <w:abstractNumId w:val="97"/>
+    <w:abstractNumId w:val="98"/>
   </w:num>
   <w:num w:numId="60">
-    <w:abstractNumId w:val="59"/>
+    <w:abstractNumId w:val="60"/>
   </w:num>
   <w:num w:numId="61">
     <w:abstractNumId w:val="27"/>
@@ -29455,16 +30783,16 @@
     <w:abstractNumId w:val="13"/>
   </w:num>
   <w:num w:numId="63">
-    <w:abstractNumId w:val="89"/>
+    <w:abstractNumId w:val="90"/>
   </w:num>
   <w:num w:numId="64">
-    <w:abstractNumId w:val="63"/>
+    <w:abstractNumId w:val="64"/>
   </w:num>
   <w:num w:numId="65">
-    <w:abstractNumId w:val="76"/>
+    <w:abstractNumId w:val="77"/>
   </w:num>
   <w:num w:numId="66">
-    <w:abstractNumId w:val="85"/>
+    <w:abstractNumId w:val="86"/>
   </w:num>
   <w:num w:numId="67">
     <w:abstractNumId w:val="8"/>
@@ -29476,7 +30804,7 @@
     <w:abstractNumId w:val="25"/>
   </w:num>
   <w:num w:numId="70">
-    <w:abstractNumId w:val="90"/>
+    <w:abstractNumId w:val="91"/>
   </w:num>
   <w:num w:numId="71">
     <w:abstractNumId w:val="19"/>
@@ -29491,19 +30819,19 @@
     <w:abstractNumId w:val="5"/>
   </w:num>
   <w:num w:numId="75">
-    <w:abstractNumId w:val="67"/>
+    <w:abstractNumId w:val="68"/>
   </w:num>
   <w:num w:numId="76">
-    <w:abstractNumId w:val="42"/>
+    <w:abstractNumId w:val="43"/>
   </w:num>
   <w:num w:numId="77">
-    <w:abstractNumId w:val="92"/>
+    <w:abstractNumId w:val="93"/>
   </w:num>
   <w:num w:numId="78">
-    <w:abstractNumId w:val="51"/>
+    <w:abstractNumId w:val="52"/>
   </w:num>
   <w:num w:numId="79">
-    <w:abstractNumId w:val="98"/>
+    <w:abstractNumId w:val="99"/>
   </w:num>
   <w:num w:numId="80">
     <w:abstractNumId w:val="33"/>
@@ -29524,46 +30852,46 @@
     <w:abstractNumId w:val="1"/>
   </w:num>
   <w:num w:numId="86">
-    <w:abstractNumId w:val="82"/>
+    <w:abstractNumId w:val="83"/>
   </w:num>
   <w:num w:numId="87">
-    <w:abstractNumId w:val="72"/>
+    <w:abstractNumId w:val="73"/>
   </w:num>
   <w:num w:numId="88">
     <w:abstractNumId w:val="18"/>
   </w:num>
   <w:num w:numId="89">
-    <w:abstractNumId w:val="102"/>
+    <w:abstractNumId w:val="103"/>
   </w:num>
   <w:num w:numId="90">
     <w:abstractNumId w:val="12"/>
   </w:num>
   <w:num w:numId="91">
-    <w:abstractNumId w:val="57"/>
+    <w:abstractNumId w:val="58"/>
   </w:num>
   <w:num w:numId="92">
-    <w:abstractNumId w:val="41"/>
+    <w:abstractNumId w:val="42"/>
   </w:num>
   <w:num w:numId="93">
-    <w:abstractNumId w:val="49"/>
+    <w:abstractNumId w:val="50"/>
   </w:num>
   <w:num w:numId="94">
-    <w:abstractNumId w:val="65"/>
+    <w:abstractNumId w:val="66"/>
   </w:num>
   <w:num w:numId="95">
-    <w:abstractNumId w:val="64"/>
+    <w:abstractNumId w:val="65"/>
   </w:num>
   <w:num w:numId="96">
     <w:abstractNumId w:val="40"/>
   </w:num>
   <w:num w:numId="97">
-    <w:abstractNumId w:val="44"/>
+    <w:abstractNumId w:val="45"/>
   </w:num>
   <w:num w:numId="98">
-    <w:abstractNumId w:val="53"/>
+    <w:abstractNumId w:val="54"/>
   </w:num>
   <w:num w:numId="99">
-    <w:abstractNumId w:val="58"/>
+    <w:abstractNumId w:val="59"/>
   </w:num>
   <w:num w:numId="100">
     <w:abstractNumId w:val="6"/>
@@ -29572,10 +30900,13 @@
     <w:abstractNumId w:val="10"/>
   </w:num>
   <w:num w:numId="102">
-    <w:abstractNumId w:val="66"/>
+    <w:abstractNumId w:val="67"/>
   </w:num>
   <w:num w:numId="103">
     <w:abstractNumId w:val="21"/>
+  </w:num>
+  <w:num w:numId="104">
+    <w:abstractNumId w:val="41"/>
   </w:num>
 </w:numbering>
 </file>

</xml_diff>